<commit_message>
Set default language to Marathi
</commit_message>
<xml_diff>
--- a/Webscraft.in Invoice 13.docx
+++ b/Webscraft.in Invoice 13.docx
@@ -71,8 +71,6 @@
         <w:tblInd w:w="2327" w:type="dxa"/>
         <w:tblCellMar>
           <w:top w:w="95" w:type="dxa"/>
-          <w:left w:w="0" w:type="dxa"/>
-          <w:bottom w:w="0" w:type="dxa"/>
           <w:right w:w="115" w:type="dxa"/>
         </w:tblCellMar>
         <w:tblLook w:val="04A0" w:firstRow="1" w:lastRow="0" w:firstColumn="1" w:lastColumn="0" w:noHBand="0" w:noVBand="1"/>
@@ -190,13 +188,7 @@
               <w:rPr>
                 <w:b/>
               </w:rPr>
-              <w:t>31</w:t>
-            </w:r>
-            <w:r>
-              <w:rPr>
-                <w:b/>
-              </w:rPr>
-              <w:t>/07/2027</w:t>
+              <w:t>31/07/2027</w:t>
             </w:r>
           </w:p>
         </w:tc>
@@ -7228,7 +7220,21 @@
           <w:b/>
           <w:sz w:val="27"/>
         </w:rPr>
-        <w:t>FREE  Weeks Social Media Management</w:t>
+        <w:t xml:space="preserve">FREE </w:t>
+      </w:r>
+      <w:r>
+        <w:rPr>
+          <w:b/>
+          <w:sz w:val="27"/>
+        </w:rPr>
+        <w:t>1</w:t>
+      </w:r>
+      <w:r>
+        <w:rPr>
+          <w:b/>
+          <w:sz w:val="27"/>
+        </w:rPr>
+        <w:t xml:space="preserve"> Week Social Media Management</w:t>
       </w:r>
     </w:p>
     <w:p>
@@ -7255,19 +7261,10 @@
         <w:ind w:right="0" w:hanging="114"/>
       </w:pPr>
       <w:r>
-        <w:t>Daily Social Media Posts</w:t>
+        <w:t>Reels / Short Video Editing</w:t>
       </w:r>
-    </w:p>
-    <w:p>
-      <w:pPr>
-        <w:numPr>
-          <w:ilvl w:val="0"/>
-          <w:numId w:val="5"/>
-        </w:numPr>
-        <w:ind w:right="0" w:hanging="114"/>
-      </w:pPr>
       <w:r>
-        <w:t>Reels / Short Video Editing</w:t>
+        <w:t xml:space="preserve"> (1 week)</w:t>
       </w:r>
     </w:p>
     <w:p>
@@ -7788,8 +7785,6 @@
         <w:tblInd w:w="2752" w:type="dxa"/>
         <w:tblCellMar>
           <w:top w:w="95" w:type="dxa"/>
-          <w:left w:w="0" w:type="dxa"/>
-          <w:bottom w:w="0" w:type="dxa"/>
           <w:right w:w="115" w:type="dxa"/>
         </w:tblCellMar>
         <w:tblLook w:val="04A0" w:firstRow="1" w:lastRow="0" w:firstColumn="1" w:lastColumn="0" w:noHBand="0" w:noVBand="1"/>
@@ -8091,8 +8086,6 @@
         <w:tblInd w:w="2176" w:type="dxa"/>
         <w:tblCellMar>
           <w:top w:w="95" w:type="dxa"/>
-          <w:left w:w="0" w:type="dxa"/>
-          <w:bottom w:w="0" w:type="dxa"/>
           <w:right w:w="115" w:type="dxa"/>
         </w:tblCellMar>
         <w:tblLook w:val="04A0" w:firstRow="1" w:lastRow="0" w:firstColumn="1" w:lastColumn="0" w:noHBand="0" w:noVBand="1"/>
@@ -8522,7 +8515,10 @@
         <w:t>Account Name:</w:t>
       </w:r>
       <w:r>
-        <w:t xml:space="preserve"> Webscraft.in</w:t>
+        <w:t xml:space="preserve"> </w:t>
+      </w:r>
+      <w:r>
+        <w:t xml:space="preserve">Sarthak Waghmare </w:t>
       </w:r>
     </w:p>
     <w:p>

</xml_diff>